<commit_message>
Now we can put pictures into documents
</commit_message>
<xml_diff>
--- a/guide_builder/P03_Gamepad_Driving_Guide.docx
+++ b/guide_builder/P03_Gamepad_Driving_Guide.docx
@@ -133,7 +133,56 @@
         <w:spacing w:after="120" w:before="260"/>
       </w:pPr>
       <w:r>
-        <w:t xml:space="preserve">1. Tank drive</w:t>
+        <w:t xml:space="preserve">What is already in your file</w:t>
+      </w:r>
+    </w:p>
+    <w:p>
+      <w:pPr>
+        <w:spacing w:after="120" w:line="276"/>
+      </w:pPr>
+      <w:r>
+        <w:rPr>
+          <w:sz w:val="22"/>
+          <w:szCs w:val="22"/>
+        </w:rPr>
+        <w:t xml:space="preserve">Your file comes with the setup lines, the loop, and the shutdown line. The three </w:t>
+      </w:r>
+      <w:r>
+        <w:rPr>
+          <w:rFonts w:ascii="Roboto Mono" w:cs="Roboto Mono" w:eastAsia="Roboto Mono" w:hAnsi="Roboto Mono"/>
+          <w:sz w:val="19"/>
+          <w:szCs w:val="19"/>
+        </w:rPr>
+        <w:t xml:space="preserve"># WORK</w:t>
+      </w:r>
+      <w:r>
+        <w:rPr>
+          <w:sz w:val="22"/>
+          <w:szCs w:val="22"/>
+        </w:rPr>
+        <w:t xml:space="preserve"> blocks are empty.</w:t>
+      </w:r>
+    </w:p>
+    <w:p>
+      <w:pPr>
+        <w:spacing w:after="120" w:line="276"/>
+      </w:pPr>
+      <w:r>
+        <w:rPr>
+          <w:sz w:val="22"/>
+          <w:szCs w:val="22"/>
+        </w:rPr>
+        <w:t xml:space="preserve">You fill them by typing the code out of Part 2 by hand, the same way you did in P01 and P02. Thonny still does the indenting.</w:t>
+      </w:r>
+    </w:p>
+    <w:p>
+      <w:pPr>
+        <w:pStyle w:val="Heading2"/>
+        <w:keepNext/>
+        <w:spacing w:after="120" w:before="260"/>
+      </w:pPr>
+      <w:r>
+        <w:t xml:space="preserve">How tank drive steers</w:t>
       </w:r>
     </w:p>
     <w:p>
@@ -235,76 +284,19 @@
         <w:spacing w:after="120" w:before="260"/>
       </w:pPr>
       <w:r>
-        <w:t xml:space="preserve">2. A new SuperBot tool</w:t>
-      </w:r>
-    </w:p>
-    <w:p>
-      <w:pPr>
-        <w:spacing w:after="120" w:line="276"/>
-      </w:pPr>
-      <w:r>
-        <w:rPr>
-          <w:sz w:val="22"/>
-          <w:szCs w:val="22"/>
-        </w:rPr>
-        <w:t xml:space="preserve">You already know </w:t>
-      </w:r>
-      <w:r>
-        <w:rPr>
-          <w:rFonts w:ascii="Roboto Mono" w:cs="Roboto Mono" w:eastAsia="Roboto Mono" w:hAnsi="Roboto Mono"/>
-          <w:sz w:val="19"/>
-          <w:szCs w:val="19"/>
-        </w:rPr>
-        <w:t xml:space="preserve">sb = SuperBot(alvik)</w:t>
-      </w:r>
-      <w:r>
-        <w:rPr>
-          <w:sz w:val="22"/>
-          <w:szCs w:val="22"/>
-        </w:rPr>
-        <w:t xml:space="preserve"> from P01, where you used </w:t>
-      </w:r>
-      <w:r>
-        <w:rPr>
-          <w:rFonts w:ascii="Roboto Mono" w:cs="Roboto Mono" w:eastAsia="Roboto Mono" w:hAnsi="Roboto Mono"/>
-          <w:sz w:val="19"/>
-          <w:szCs w:val="19"/>
-        </w:rPr>
-        <w:t xml:space="preserve">sb.held('cancel')</w:t>
-      </w:r>
-      <w:r>
-        <w:rPr>
-          <w:sz w:val="22"/>
-          <w:szCs w:val="22"/>
-        </w:rPr>
-        <w:t xml:space="preserve"> to end the loop. This project adds one more tool from the same toolbox.</w:t>
-      </w:r>
-    </w:p>
-    <w:p>
-      <w:pPr>
-        <w:spacing w:after="120" w:line="276"/>
-      </w:pPr>
-      <w:r>
-        <w:rPr>
-          <w:sz w:val="22"/>
-          <w:szCs w:val="22"/>
-        </w:rPr>
-        <w:t xml:space="preserve">It is </w:t>
-      </w:r>
-      <w:r>
-        <w:rPr>
-          <w:rFonts w:ascii="Roboto Mono" w:cs="Roboto Mono" w:eastAsia="Roboto Mono" w:hAnsi="Roboto Mono"/>
-          <w:sz w:val="19"/>
-          <w:szCs w:val="19"/>
-        </w:rPr>
-        <w:t xml:space="preserve">sb.log_info()</w:t>
-      </w:r>
-      <w:r>
-        <w:rPr>
-          <w:sz w:val="22"/>
-          <w:szCs w:val="22"/>
-        </w:rPr>
-        <w:t xml:space="preserve">. Give it any values and it prints them to the Thonny Shell and puts them on the robot's little screen at the same time:</w:t>
+        <w:t xml:space="preserve">What the sticks tell you</w:t>
+      </w:r>
+    </w:p>
+    <w:p>
+      <w:pPr>
+        <w:spacing w:after="120" w:line="276"/>
+      </w:pPr>
+      <w:r>
+        <w:rPr>
+          <w:sz w:val="22"/>
+          <w:szCs w:val="22"/>
+        </w:rPr>
+        <w:t xml:space="preserve">Your file already has the loop and the refresh:</w:t>
       </w:r>
     </w:p>
     <w:tbl>
@@ -352,104 +344,7 @@
                 <w:sz w:val="19"/>
                 <w:szCs w:val="19"/>
               </w:rPr>
-              <w:t xml:space="preserve">sb.log_info(4, 7)</w:t>
-            </w:r>
-          </w:p>
-        </w:tc>
-      </w:tr>
-    </w:tbl>
-    <w:p>
-      <w:pPr>
-        <w:spacing w:after="60" w:line="120"/>
-      </w:pPr>
-      <w:r>
-        <w:rPr>
-          <w:sz w:val="8"/>
-          <w:szCs w:val="8"/>
-        </w:rPr>
-        <w:t xml:space="preserve"/>
-      </w:r>
-    </w:p>
-    <w:p>
-      <w:pPr>
-        <w:spacing w:after="120" w:line="276"/>
-      </w:pPr>
-      <w:r>
-        <w:rPr>
-          <w:sz w:val="22"/>
-          <w:szCs w:val="22"/>
-        </w:rPr>
-        <w:t xml:space="preserve">That is the whole tool. Everything else in the toolbox can wait.</w:t>
-      </w:r>
-    </w:p>
-    <w:p>
-      <w:pPr>
-        <w:pStyle w:val="Heading2"/>
-        <w:keepNext/>
-        <w:spacing w:after="120" w:before="260"/>
-      </w:pPr>
-      <w:r>
-        <w:t xml:space="preserve">3. What the sticks report</w:t>
-      </w:r>
-    </w:p>
-    <w:p>
-      <w:pPr>
-        <w:spacing w:after="120" w:line="276"/>
-      </w:pPr>
-      <w:r>
-        <w:rPr>
-          <w:sz w:val="22"/>
-          <w:szCs w:val="22"/>
-        </w:rPr>
-        <w:t xml:space="preserve">You already know this loop from P01:</w:t>
-      </w:r>
-    </w:p>
-    <w:tbl>
-      <w:tblPr>
-        <w:tblW w:type="dxa" w:w="9360"/>
-        <w:tblBorders>
-          <w:top w:val="single" w:color="auto" w:sz="4"/>
-          <w:left w:val="single" w:color="auto" w:sz="4"/>
-          <w:bottom w:val="single" w:color="auto" w:sz="4"/>
-          <w:right w:val="single" w:color="auto" w:sz="4"/>
-          <w:insideH w:val="single" w:color="auto" w:sz="4"/>
-          <w:insideV w:val="single" w:color="auto" w:sz="4"/>
-        </w:tblBorders>
-      </w:tblPr>
-      <w:tblGrid>
-        <w:gridCol w:w="9360"/>
-      </w:tblGrid>
-      <w:tr>
-        <w:trPr>
-          <w:cantSplit/>
-        </w:trPr>
-        <w:tc>
-          <w:tcPr>
-            <w:tcW w:type="dxa" w:w="9360"/>
-            <w:tcBorders>
-              <w:top w:val="single" w:color="9A9A9A" w:sz="4"/>
-              <w:left w:val="single" w:color="9A9A9A" w:sz="4"/>
-              <w:bottom w:val="single" w:color="9A9A9A" w:sz="4"/>
-              <w:right w:val="single" w:color="9A9A9A" w:sz="4"/>
-            </w:tcBorders>
-            <w:tcMar>
-              <w:top w:type="dxa" w:w="120"/>
-              <w:left w:type="dxa" w:w="180"/>
-              <w:bottom w:type="dxa" w:w="120"/>
-              <w:right w:type="dxa" w:w="180"/>
-            </w:tcMar>
-          </w:tcPr>
-          <w:p>
-            <w:pPr>
-              <w:spacing w:after="0" w:line="240"/>
-            </w:pPr>
-            <w:r>
-              <w:rPr>
-                <w:rFonts w:ascii="Roboto Mono" w:cs="Roboto Mono" w:eastAsia="Roboto Mono" w:hAnsi="Roboto Mono"/>
-                <w:sz w:val="19"/>
-                <w:szCs w:val="19"/>
-              </w:rPr>
-              <w:t xml:space="preserve">while not (alvik.get_touch_cancel() or gamepad.buttons['options']):</w:t>
+              <w:t xml:space="preserve">while not (sb.held('cancel') or gamepad.held('options')):</w:t>
             </w:r>
           </w:p>
           <w:p>
@@ -665,7 +560,23 @@
           <w:sz w:val="22"/>
           <w:szCs w:val="22"/>
         </w:rPr>
-        <w:t xml:space="preserve">Halfway forward is about +0.5. The stick reports how far you pushed it, not just which way. Looking at those numbers for yourself is WORK 1.</w:t>
+        <w:t xml:space="preserve">Halfway forward is about +0.5. The stick reports </w:t>
+      </w:r>
+      <w:r>
+        <w:rPr>
+          <w:i/>
+          <w:iCs/>
+          <w:sz w:val="22"/>
+          <w:szCs w:val="22"/>
+        </w:rPr>
+        <w:t xml:space="preserve">how far</w:t>
+      </w:r>
+      <w:r>
+        <w:rPr>
+          <w:sz w:val="22"/>
+          <w:szCs w:val="22"/>
+        </w:rPr>
+        <w:t xml:space="preserve"> you pushed it, not just which way. That is what makes smooth driving possible.</w:t>
       </w:r>
     </w:p>
     <w:p>
@@ -675,31 +586,34 @@
         <w:spacing w:after="120" w:before="260"/>
       </w:pPr>
       <w:r>
-        <w:t xml:space="preserve">4. One press, one reading</w:t>
-      </w:r>
-    </w:p>
-    <w:p>
-      <w:pPr>
-        <w:spacing w:after="120" w:line="276"/>
-      </w:pPr>
-      <w:r>
-        <w:rPr>
-          <w:sz w:val="22"/>
-          <w:szCs w:val="22"/>
-        </w:rPr>
-        <w:t xml:space="preserve">Your loop runs about fifty times a second. If you print inside it, you get fifty lines a second and the Shell turns to soup.</w:t>
-      </w:r>
-    </w:p>
-    <w:p>
-      <w:pPr>
-        <w:spacing w:after="120" w:line="276"/>
-      </w:pPr>
-      <w:r>
-        <w:rPr>
-          <w:sz w:val="22"/>
-          <w:szCs w:val="22"/>
-        </w:rPr>
-        <w:t xml:space="preserve">So your file has a helper already made:</w:t>
+        <w:t xml:space="preserve">SuperBot can print for you</w:t>
+      </w:r>
+    </w:p>
+    <w:p>
+      <w:pPr>
+        <w:spacing w:after="120" w:line="276"/>
+      </w:pPr>
+      <w:r>
+        <w:rPr>
+          <w:sz w:val="22"/>
+          <w:szCs w:val="22"/>
+        </w:rPr>
+        <w:t xml:space="preserve">You cannot see inside a running robot. There is no way to know what </w:t>
+      </w:r>
+      <w:r>
+        <w:rPr>
+          <w:rFonts w:ascii="Roboto Mono" w:cs="Roboto Mono" w:eastAsia="Roboto Mono" w:hAnsi="Roboto Mono"/>
+          <w:sz w:val="19"/>
+          <w:szCs w:val="19"/>
+        </w:rPr>
+        <w:t xml:space="preserve">gamepad.left_y</w:t>
+      </w:r>
+      <w:r>
+        <w:rPr>
+          <w:sz w:val="22"/>
+          <w:szCs w:val="22"/>
+        </w:rPr>
+        <w:t xml:space="preserve"> is right now by staring at the robot. The suit has a power for that:</w:t>
       </w:r>
     </w:p>
     <w:tbl>
@@ -747,7 +661,7 @@
                 <w:sz w:val="19"/>
                 <w:szCs w:val="19"/>
               </w:rPr>
-              <w:t xml:space="preserve">btn_x = Button(x_is_down)</w:t>
+              <w:t xml:space="preserve">sb.log_info(gamepad.left_y)</w:t>
             </w:r>
           </w:p>
         </w:tc>
@@ -771,46 +685,10 @@
       </w:pPr>
       <w:r>
         <w:rPr>
-          <w:rFonts w:ascii="Roboto Mono" w:cs="Roboto Mono" w:eastAsia="Roboto Mono" w:hAnsi="Roboto Mono"/>
-          <w:sz w:val="19"/>
-          <w:szCs w:val="19"/>
-        </w:rPr>
-        <w:t xml:space="preserve">btn_x.is_pressed()</w:t>
-      </w:r>
-      <w:r>
-        <w:rPr>
-          <w:sz w:val="22"/>
-          <w:szCs w:val="22"/>
-        </w:rPr>
-        <w:t xml:space="preserve"> is True only at the </w:t>
-      </w:r>
-      <w:r>
-        <w:rPr>
-          <w:i/>
-          <w:iCs/>
-          <w:sz w:val="22"/>
-          <w:szCs w:val="22"/>
-        </w:rPr>
-        <w:t xml:space="preserve">instant</w:t>
-      </w:r>
-      <w:r>
-        <w:rPr>
-          <w:sz w:val="22"/>
-          <w:szCs w:val="22"/>
-        </w:rPr>
-        <w:t xml:space="preserve"> you push X down. Hold the button and it is True once, not two hundred times. Let go and press again for a second reading.</w:t>
-      </w:r>
-    </w:p>
-    <w:p>
-      <w:pPr>
-        <w:spacing w:after="120" w:line="276"/>
-      </w:pPr>
-      <w:r>
-        <w:rPr>
-          <w:sz w:val="22"/>
-          <w:szCs w:val="22"/>
-        </w:rPr>
-        <w:t xml:space="preserve">That is why WORK 1 looks like this:</w:t>
+          <w:sz w:val="22"/>
+          <w:szCs w:val="22"/>
+        </w:rPr>
+        <w:t xml:space="preserve">Whatever you hand it gets printed in the Thonny Shell and shown on the robot's little screen at the same time. Push the left stick about halfway forward and that line prints:</w:t>
       </w:r>
     </w:p>
     <w:tbl>
@@ -858,7 +736,362 @@
                 <w:sz w:val="19"/>
                 <w:szCs w:val="19"/>
               </w:rPr>
-              <w:t xml:space="preserve">if btn_x.is_pressed():</w:t>
+              <w:t xml:space="preserve">0.51</w:t>
+            </w:r>
+          </w:p>
+        </w:tc>
+      </w:tr>
+    </w:tbl>
+    <w:p>
+      <w:pPr>
+        <w:spacing w:after="60" w:line="120"/>
+      </w:pPr>
+      <w:r>
+        <w:rPr>
+          <w:sz w:val="8"/>
+          <w:szCs w:val="8"/>
+        </w:rPr>
+        <w:t xml:space="preserve"/>
+      </w:r>
+    </w:p>
+    <w:p>
+      <w:pPr>
+        <w:spacing w:after="120" w:line="276"/>
+      </w:pPr>
+      <w:r>
+        <w:rPr>
+          <w:sz w:val="22"/>
+          <w:szCs w:val="22"/>
+        </w:rPr>
+        <w:t xml:space="preserve">Hand it two values and you get both, side by side:</w:t>
+      </w:r>
+    </w:p>
+    <w:tbl>
+      <w:tblPr>
+        <w:tblW w:type="dxa" w:w="9360"/>
+        <w:tblBorders>
+          <w:top w:val="single" w:color="auto" w:sz="4"/>
+          <w:left w:val="single" w:color="auto" w:sz="4"/>
+          <w:bottom w:val="single" w:color="auto" w:sz="4"/>
+          <w:right w:val="single" w:color="auto" w:sz="4"/>
+          <w:insideH w:val="single" w:color="auto" w:sz="4"/>
+          <w:insideV w:val="single" w:color="auto" w:sz="4"/>
+        </w:tblBorders>
+      </w:tblPr>
+      <w:tblGrid>
+        <w:gridCol w:w="9360"/>
+      </w:tblGrid>
+      <w:tr>
+        <w:trPr>
+          <w:cantSplit/>
+        </w:trPr>
+        <w:tc>
+          <w:tcPr>
+            <w:tcW w:type="dxa" w:w="9360"/>
+            <w:tcBorders>
+              <w:top w:val="single" w:color="9A9A9A" w:sz="4"/>
+              <w:left w:val="single" w:color="9A9A9A" w:sz="4"/>
+              <w:bottom w:val="single" w:color="9A9A9A" w:sz="4"/>
+              <w:right w:val="single" w:color="9A9A9A" w:sz="4"/>
+            </w:tcBorders>
+            <w:tcMar>
+              <w:top w:type="dxa" w:w="120"/>
+              <w:left w:type="dxa" w:w="180"/>
+              <w:bottom w:type="dxa" w:w="120"/>
+              <w:right w:type="dxa" w:w="180"/>
+            </w:tcMar>
+          </w:tcPr>
+          <w:p>
+            <w:pPr>
+              <w:spacing w:after="0" w:line="240"/>
+            </w:pPr>
+            <w:r>
+              <w:rPr>
+                <w:rFonts w:ascii="Roboto Mono" w:cs="Roboto Mono" w:eastAsia="Roboto Mono" w:hAnsi="Roboto Mono"/>
+                <w:sz w:val="19"/>
+                <w:szCs w:val="19"/>
+              </w:rPr>
+              <w:t xml:space="preserve">sb.log_info(gamepad.left_y, gamepad.right_y)</w:t>
+            </w:r>
+          </w:p>
+        </w:tc>
+      </w:tr>
+    </w:tbl>
+    <w:p>
+      <w:pPr>
+        <w:spacing w:after="60" w:line="120"/>
+      </w:pPr>
+      <w:r>
+        <w:rPr>
+          <w:sz w:val="8"/>
+          <w:szCs w:val="8"/>
+        </w:rPr>
+        <w:t xml:space="preserve"/>
+      </w:r>
+    </w:p>
+    <w:tbl>
+      <w:tblPr>
+        <w:tblW w:type="dxa" w:w="9360"/>
+        <w:tblBorders>
+          <w:top w:val="single" w:color="auto" w:sz="4"/>
+          <w:left w:val="single" w:color="auto" w:sz="4"/>
+          <w:bottom w:val="single" w:color="auto" w:sz="4"/>
+          <w:right w:val="single" w:color="auto" w:sz="4"/>
+          <w:insideH w:val="single" w:color="auto" w:sz="4"/>
+          <w:insideV w:val="single" w:color="auto" w:sz="4"/>
+        </w:tblBorders>
+      </w:tblPr>
+      <w:tblGrid>
+        <w:gridCol w:w="9360"/>
+      </w:tblGrid>
+      <w:tr>
+        <w:trPr>
+          <w:cantSplit/>
+        </w:trPr>
+        <w:tc>
+          <w:tcPr>
+            <w:tcW w:type="dxa" w:w="9360"/>
+            <w:tcBorders>
+              <w:top w:val="single" w:color="9A9A9A" w:sz="4"/>
+              <w:left w:val="single" w:color="9A9A9A" w:sz="4"/>
+              <w:bottom w:val="single" w:color="9A9A9A" w:sz="4"/>
+              <w:right w:val="single" w:color="9A9A9A" w:sz="4"/>
+            </w:tcBorders>
+            <w:tcMar>
+              <w:top w:type="dxa" w:w="120"/>
+              <w:left w:type="dxa" w:w="180"/>
+              <w:bottom w:type="dxa" w:w="120"/>
+              <w:right w:type="dxa" w:w="180"/>
+            </w:tcMar>
+          </w:tcPr>
+          <w:p>
+            <w:pPr>
+              <w:spacing w:after="0" w:line="240"/>
+            </w:pPr>
+            <w:r>
+              <w:rPr>
+                <w:rFonts w:ascii="Roboto Mono" w:cs="Roboto Mono" w:eastAsia="Roboto Mono" w:hAnsi="Roboto Mono"/>
+                <w:sz w:val="19"/>
+                <w:szCs w:val="19"/>
+              </w:rPr>
+              <w:t xml:space="preserve">0.51 -0.23</w:t>
+            </w:r>
+          </w:p>
+        </w:tc>
+      </w:tr>
+    </w:tbl>
+    <w:p>
+      <w:pPr>
+        <w:spacing w:after="60" w:line="120"/>
+      </w:pPr>
+      <w:r>
+        <w:rPr>
+          <w:sz w:val="8"/>
+          <w:szCs w:val="8"/>
+        </w:rPr>
+        <w:t xml:space="preserve"/>
+      </w:r>
+    </w:p>
+    <w:p>
+      <w:pPr>
+        <w:spacing w:after="120" w:line="276"/>
+      </w:pPr>
+      <w:r>
+        <w:rPr>
+          <w:sz w:val="22"/>
+          <w:szCs w:val="22"/>
+        </w:rPr>
+        <w:t xml:space="preserve">That is the third power you have used, after </w:t>
+      </w:r>
+      <w:r>
+        <w:rPr>
+          <w:rFonts w:ascii="Roboto Mono" w:cs="Roboto Mono" w:eastAsia="Roboto Mono" w:hAnsi="Roboto Mono"/>
+          <w:sz w:val="19"/>
+          <w:szCs w:val="19"/>
+        </w:rPr>
+        <w:t xml:space="preserve">sb.held</w:t>
+      </w:r>
+      <w:r>
+        <w:rPr>
+          <w:sz w:val="22"/>
+          <w:szCs w:val="22"/>
+        </w:rPr>
+        <w:t xml:space="preserve"> and </w:t>
+      </w:r>
+      <w:r>
+        <w:rPr>
+          <w:rFonts w:ascii="Roboto Mono" w:cs="Roboto Mono" w:eastAsia="Roboto Mono" w:hAnsi="Roboto Mono"/>
+          <w:sz w:val="19"/>
+          <w:szCs w:val="19"/>
+        </w:rPr>
+        <w:t xml:space="preserve">sb.light_both_leds</w:t>
+      </w:r>
+      <w:r>
+        <w:rPr>
+          <w:sz w:val="22"/>
+          <w:szCs w:val="22"/>
+        </w:rPr>
+        <w:t xml:space="preserve">.</w:t>
+      </w:r>
+    </w:p>
+    <w:p>
+      <w:pPr>
+        <w:pStyle w:val="Heading2"/>
+        <w:keepNext/>
+        <w:spacing w:after="120" w:before="260"/>
+      </w:pPr>
+      <w:r>
+        <w:t xml:space="preserve">One press, one reading</w:t>
+      </w:r>
+    </w:p>
+    <w:p>
+      <w:pPr>
+        <w:spacing w:after="120" w:line="276"/>
+      </w:pPr>
+      <w:r>
+        <w:rPr>
+          <w:sz w:val="22"/>
+          <w:szCs w:val="22"/>
+        </w:rPr>
+        <w:t xml:space="preserve">Now try to use it. Drop </w:t>
+      </w:r>
+      <w:r>
+        <w:rPr>
+          <w:rFonts w:ascii="Roboto Mono" w:cs="Roboto Mono" w:eastAsia="Roboto Mono" w:hAnsi="Roboto Mono"/>
+          <w:sz w:val="19"/>
+          <w:szCs w:val="19"/>
+        </w:rPr>
+        <w:t xml:space="preserve">sb.log_info</w:t>
+      </w:r>
+      <w:r>
+        <w:rPr>
+          <w:sz w:val="22"/>
+          <w:szCs w:val="22"/>
+        </w:rPr>
+        <w:t xml:space="preserve"> into the loop on its own:</w:t>
+      </w:r>
+    </w:p>
+    <w:tbl>
+      <w:tblPr>
+        <w:tblW w:type="dxa" w:w="9360"/>
+        <w:tblBorders>
+          <w:top w:val="single" w:color="auto" w:sz="4"/>
+          <w:left w:val="single" w:color="auto" w:sz="4"/>
+          <w:bottom w:val="single" w:color="auto" w:sz="4"/>
+          <w:right w:val="single" w:color="auto" w:sz="4"/>
+          <w:insideH w:val="single" w:color="auto" w:sz="4"/>
+          <w:insideV w:val="single" w:color="auto" w:sz="4"/>
+        </w:tblBorders>
+      </w:tblPr>
+      <w:tblGrid>
+        <w:gridCol w:w="9360"/>
+      </w:tblGrid>
+      <w:tr>
+        <w:trPr>
+          <w:cantSplit/>
+        </w:trPr>
+        <w:tc>
+          <w:tcPr>
+            <w:tcW w:type="dxa" w:w="9360"/>
+            <w:tcBorders>
+              <w:top w:val="single" w:color="9A9A9A" w:sz="4"/>
+              <w:left w:val="single" w:color="9A9A9A" w:sz="4"/>
+              <w:bottom w:val="single" w:color="9A9A9A" w:sz="4"/>
+              <w:right w:val="single" w:color="9A9A9A" w:sz="4"/>
+            </w:tcBorders>
+            <w:tcMar>
+              <w:top w:type="dxa" w:w="120"/>
+              <w:left w:type="dxa" w:w="180"/>
+              <w:bottom w:type="dxa" w:w="120"/>
+              <w:right w:type="dxa" w:w="180"/>
+            </w:tcMar>
+          </w:tcPr>
+          <w:p>
+            <w:pPr>
+              <w:spacing w:after="0" w:line="240"/>
+            </w:pPr>
+            <w:r>
+              <w:rPr>
+                <w:rFonts w:ascii="Roboto Mono" w:cs="Roboto Mono" w:eastAsia="Roboto Mono" w:hAnsi="Roboto Mono"/>
+                <w:sz w:val="19"/>
+                <w:szCs w:val="19"/>
+              </w:rPr>
+              <w:t xml:space="preserve">sb.log_info(gamepad.left_y, gamepad.right_y)</w:t>
+            </w:r>
+          </w:p>
+        </w:tc>
+      </w:tr>
+    </w:tbl>
+    <w:p>
+      <w:pPr>
+        <w:spacing w:after="60" w:line="120"/>
+      </w:pPr>
+      <w:r>
+        <w:rPr>
+          <w:sz w:val="8"/>
+          <w:szCs w:val="8"/>
+        </w:rPr>
+        <w:t xml:space="preserve"/>
+      </w:r>
+    </w:p>
+    <w:p>
+      <w:pPr>
+        <w:spacing w:after="120" w:line="276"/>
+      </w:pPr>
+      <w:r>
+        <w:rPr>
+          <w:sz w:val="22"/>
+          <w:szCs w:val="22"/>
+        </w:rPr>
+        <w:t xml:space="preserve">Every trip through the loop prints a line, and the loop runs about fifty times a second:</w:t>
+      </w:r>
+    </w:p>
+    <w:tbl>
+      <w:tblPr>
+        <w:tblW w:type="dxa" w:w="9360"/>
+        <w:tblBorders>
+          <w:top w:val="single" w:color="auto" w:sz="4"/>
+          <w:left w:val="single" w:color="auto" w:sz="4"/>
+          <w:bottom w:val="single" w:color="auto" w:sz="4"/>
+          <w:right w:val="single" w:color="auto" w:sz="4"/>
+          <w:insideH w:val="single" w:color="auto" w:sz="4"/>
+          <w:insideV w:val="single" w:color="auto" w:sz="4"/>
+        </w:tblBorders>
+      </w:tblPr>
+      <w:tblGrid>
+        <w:gridCol w:w="9360"/>
+      </w:tblGrid>
+      <w:tr>
+        <w:trPr>
+          <w:cantSplit/>
+        </w:trPr>
+        <w:tc>
+          <w:tcPr>
+            <w:tcW w:type="dxa" w:w="9360"/>
+            <w:tcBorders>
+              <w:top w:val="single" w:color="9A9A9A" w:sz="4"/>
+              <w:left w:val="single" w:color="9A9A9A" w:sz="4"/>
+              <w:bottom w:val="single" w:color="9A9A9A" w:sz="4"/>
+              <w:right w:val="single" w:color="9A9A9A" w:sz="4"/>
+            </w:tcBorders>
+            <w:tcMar>
+              <w:top w:type="dxa" w:w="120"/>
+              <w:left w:type="dxa" w:w="180"/>
+              <w:bottom w:type="dxa" w:w="120"/>
+              <w:right w:type="dxa" w:w="180"/>
+            </w:tcMar>
+          </w:tcPr>
+          <w:p>
+            <w:pPr>
+              <w:spacing w:after="0" w:line="240"/>
+            </w:pPr>
+            <w:r>
+              <w:rPr>
+                <w:rFonts w:ascii="Roboto Mono" w:cs="Roboto Mono" w:eastAsia="Roboto Mono" w:hAnsi="Roboto Mono"/>
+                <w:sz w:val="19"/>
+                <w:szCs w:val="19"/>
+              </w:rPr>
+              <w:t xml:space="preserve">0.0 0.0</w:t>
             </w:r>
           </w:p>
           <w:p>
@@ -871,7 +1104,33 @@
                 <w:sz w:val="19"/>
                 <w:szCs w:val="19"/>
               </w:rPr>
-              <w:t xml:space="preserve">    sb.log_info(...)</w:t>
+              <w:t xml:space="preserve">0.0 0.0</w:t>
+            </w:r>
+          </w:p>
+          <w:p>
+            <w:pPr>
+              <w:spacing w:after="0" w:line="240"/>
+            </w:pPr>
+            <w:r>
+              <w:rPr>
+                <w:rFonts w:ascii="Roboto Mono" w:cs="Roboto Mono" w:eastAsia="Roboto Mono" w:hAnsi="Roboto Mono"/>
+                <w:sz w:val="19"/>
+                <w:szCs w:val="19"/>
+              </w:rPr>
+              <w:t xml:space="preserve">0.0 0.0</w:t>
+            </w:r>
+          </w:p>
+          <w:p>
+            <w:pPr>
+              <w:spacing w:after="0" w:line="240"/>
+            </w:pPr>
+            <w:r>
+              <w:rPr>
+                <w:rFonts w:ascii="Roboto Mono" w:cs="Roboto Mono" w:eastAsia="Roboto Mono" w:hAnsi="Roboto Mono"/>
+                <w:sz w:val="19"/>
+                <w:szCs w:val="19"/>
+              </w:rPr>
+              <w:t xml:space="preserve">... fifty more of these, every second</w:t>
             </w:r>
           </w:p>
         </w:tc>
@@ -898,7 +1157,306 @@
           <w:sz w:val="22"/>
           <w:szCs w:val="22"/>
         </w:rPr>
-        <w:t xml:space="preserve">One press, one line of output.</w:t>
+        <w:t xml:space="preserve">The numbers scroll past faster than you can read them.</w:t>
+      </w:r>
+    </w:p>
+    <w:p>
+      <w:pPr>
+        <w:spacing w:after="120" w:line="276"/>
+      </w:pPr>
+      <w:r>
+        <w:rPr>
+          <w:sz w:val="22"/>
+          <w:szCs w:val="22"/>
+        </w:rPr>
+        <w:t xml:space="preserve">So put it behind a button. You already used </w:t>
+      </w:r>
+      <w:r>
+        <w:rPr>
+          <w:rFonts w:ascii="Roboto Mono" w:cs="Roboto Mono" w:eastAsia="Roboto Mono" w:hAnsi="Roboto Mono"/>
+          <w:sz w:val="19"/>
+          <w:szCs w:val="19"/>
+        </w:rPr>
+        <w:t xml:space="preserve">held</w:t>
+      </w:r>
+      <w:r>
+        <w:rPr>
+          <w:sz w:val="22"/>
+          <w:szCs w:val="22"/>
+        </w:rPr>
+        <w:t xml:space="preserve"> up in the loop line, and it looks like the obvious tool:</w:t>
+      </w:r>
+    </w:p>
+    <w:tbl>
+      <w:tblPr>
+        <w:tblW w:type="dxa" w:w="9360"/>
+        <w:tblBorders>
+          <w:top w:val="single" w:color="auto" w:sz="4"/>
+          <w:left w:val="single" w:color="auto" w:sz="4"/>
+          <w:bottom w:val="single" w:color="auto" w:sz="4"/>
+          <w:right w:val="single" w:color="auto" w:sz="4"/>
+          <w:insideH w:val="single" w:color="auto" w:sz="4"/>
+          <w:insideV w:val="single" w:color="auto" w:sz="4"/>
+        </w:tblBorders>
+      </w:tblPr>
+      <w:tblGrid>
+        <w:gridCol w:w="9360"/>
+      </w:tblGrid>
+      <w:tr>
+        <w:trPr>
+          <w:cantSplit/>
+        </w:trPr>
+        <w:tc>
+          <w:tcPr>
+            <w:tcW w:type="dxa" w:w="9360"/>
+            <w:tcBorders>
+              <w:top w:val="single" w:color="9A9A9A" w:sz="4"/>
+              <w:left w:val="single" w:color="9A9A9A" w:sz="4"/>
+              <w:bottom w:val="single" w:color="9A9A9A" w:sz="4"/>
+              <w:right w:val="single" w:color="9A9A9A" w:sz="4"/>
+            </w:tcBorders>
+            <w:tcMar>
+              <w:top w:type="dxa" w:w="120"/>
+              <w:left w:type="dxa" w:w="180"/>
+              <w:bottom w:type="dxa" w:w="120"/>
+              <w:right w:type="dxa" w:w="180"/>
+            </w:tcMar>
+          </w:tcPr>
+          <w:p>
+            <w:pPr>
+              <w:spacing w:after="0" w:line="240"/>
+            </w:pPr>
+            <w:r>
+              <w:rPr>
+                <w:rFonts w:ascii="Roboto Mono" w:cs="Roboto Mono" w:eastAsia="Roboto Mono" w:hAnsi="Roboto Mono"/>
+                <w:sz w:val="19"/>
+                <w:szCs w:val="19"/>
+              </w:rPr>
+              <w:t xml:space="preserve">if gamepad.held('cross'):</w:t>
+            </w:r>
+          </w:p>
+          <w:p>
+            <w:pPr>
+              <w:spacing w:after="0" w:line="240"/>
+            </w:pPr>
+            <w:r>
+              <w:rPr>
+                <w:rFonts w:ascii="Roboto Mono" w:cs="Roboto Mono" w:eastAsia="Roboto Mono" w:hAnsi="Roboto Mono"/>
+                <w:sz w:val="19"/>
+                <w:szCs w:val="19"/>
+              </w:rPr>
+              <w:t xml:space="preserve">    sb.log_info(gamepad.left_y, gamepad.right_y)</w:t>
+            </w:r>
+          </w:p>
+        </w:tc>
+      </w:tr>
+    </w:tbl>
+    <w:p>
+      <w:pPr>
+        <w:spacing w:after="60" w:line="120"/>
+      </w:pPr>
+      <w:r>
+        <w:rPr>
+          <w:sz w:val="8"/>
+          <w:szCs w:val="8"/>
+        </w:rPr>
+        <w:t xml:space="preserve"/>
+      </w:r>
+    </w:p>
+    <w:p>
+      <w:pPr>
+        <w:spacing w:after="120" w:line="276"/>
+      </w:pPr>
+      <w:r>
+        <w:rPr>
+          <w:sz w:val="22"/>
+          <w:szCs w:val="22"/>
+        </w:rPr>
+        <w:t xml:space="preserve">Better, but not much. </w:t>
+      </w:r>
+      <w:r>
+        <w:rPr>
+          <w:rFonts w:ascii="Roboto Mono" w:cs="Roboto Mono" w:eastAsia="Roboto Mono" w:hAnsi="Roboto Mono"/>
+          <w:sz w:val="19"/>
+          <w:szCs w:val="19"/>
+        </w:rPr>
+        <w:t xml:space="preserve">held</w:t>
+      </w:r>
+      <w:r>
+        <w:rPr>
+          <w:sz w:val="22"/>
+          <w:szCs w:val="22"/>
+        </w:rPr>
+        <w:t xml:space="preserve"> is True the </w:t>
+      </w:r>
+      <w:r>
+        <w:rPr>
+          <w:i/>
+          <w:iCs/>
+          <w:sz w:val="22"/>
+          <w:szCs w:val="22"/>
+        </w:rPr>
+        <w:t xml:space="preserve">whole time</w:t>
+      </w:r>
+      <w:r>
+        <w:rPr>
+          <w:sz w:val="22"/>
+          <w:szCs w:val="22"/>
+        </w:rPr>
+        <w:t xml:space="preserve"> the button is down, and nobody can tap a button for less than a fiftieth of a second. You still get a burst of ten or twenty lines. You just get them in clumps now.</w:t>
+      </w:r>
+    </w:p>
+    <w:p>
+      <w:pPr>
+        <w:spacing w:after="120" w:line="276"/>
+      </w:pPr>
+      <w:r>
+        <w:rPr>
+          <w:sz w:val="22"/>
+          <w:szCs w:val="22"/>
+        </w:rPr>
+        <w:t xml:space="preserve">What you want is one line per press:</w:t>
+      </w:r>
+    </w:p>
+    <w:tbl>
+      <w:tblPr>
+        <w:tblW w:type="dxa" w:w="9360"/>
+        <w:tblBorders>
+          <w:top w:val="single" w:color="auto" w:sz="4"/>
+          <w:left w:val="single" w:color="auto" w:sz="4"/>
+          <w:bottom w:val="single" w:color="auto" w:sz="4"/>
+          <w:right w:val="single" w:color="auto" w:sz="4"/>
+          <w:insideH w:val="single" w:color="auto" w:sz="4"/>
+          <w:insideV w:val="single" w:color="auto" w:sz="4"/>
+        </w:tblBorders>
+      </w:tblPr>
+      <w:tblGrid>
+        <w:gridCol w:w="9360"/>
+      </w:tblGrid>
+      <w:tr>
+        <w:trPr>
+          <w:cantSplit/>
+        </w:trPr>
+        <w:tc>
+          <w:tcPr>
+            <w:tcW w:type="dxa" w:w="9360"/>
+            <w:tcBorders>
+              <w:top w:val="single" w:color="9A9A9A" w:sz="4"/>
+              <w:left w:val="single" w:color="9A9A9A" w:sz="4"/>
+              <w:bottom w:val="single" w:color="9A9A9A" w:sz="4"/>
+              <w:right w:val="single" w:color="9A9A9A" w:sz="4"/>
+            </w:tcBorders>
+            <w:tcMar>
+              <w:top w:type="dxa" w:w="120"/>
+              <w:left w:type="dxa" w:w="180"/>
+              <w:bottom w:type="dxa" w:w="120"/>
+              <w:right w:type="dxa" w:w="180"/>
+            </w:tcMar>
+          </w:tcPr>
+          <w:p>
+            <w:pPr>
+              <w:spacing w:after="0" w:line="240"/>
+            </w:pPr>
+            <w:r>
+              <w:rPr>
+                <w:rFonts w:ascii="Roboto Mono" w:cs="Roboto Mono" w:eastAsia="Roboto Mono" w:hAnsi="Roboto Mono"/>
+                <w:sz w:val="19"/>
+                <w:szCs w:val="19"/>
+              </w:rPr>
+              <w:t xml:space="preserve">gamepad.pressed('cross')</w:t>
+            </w:r>
+          </w:p>
+        </w:tc>
+      </w:tr>
+    </w:tbl>
+    <w:p>
+      <w:pPr>
+        <w:spacing w:after="60" w:line="120"/>
+      </w:pPr>
+      <w:r>
+        <w:rPr>
+          <w:sz w:val="8"/>
+          <w:szCs w:val="8"/>
+        </w:rPr>
+        <w:t xml:space="preserve"/>
+      </w:r>
+    </w:p>
+    <w:p>
+      <w:pPr>
+        <w:spacing w:after="120" w:line="276"/>
+      </w:pPr>
+      <w:r>
+        <w:rPr>
+          <w:rFonts w:ascii="Roboto Mono" w:cs="Roboto Mono" w:eastAsia="Roboto Mono" w:hAnsi="Roboto Mono"/>
+          <w:sz w:val="19"/>
+          <w:szCs w:val="19"/>
+        </w:rPr>
+        <w:t xml:space="preserve">pressed</w:t>
+      </w:r>
+      <w:r>
+        <w:rPr>
+          <w:sz w:val="22"/>
+          <w:szCs w:val="22"/>
+        </w:rPr>
+        <w:t xml:space="preserve"> is True only at the </w:t>
+      </w:r>
+      <w:r>
+        <w:rPr>
+          <w:i/>
+          <w:iCs/>
+          <w:sz w:val="22"/>
+          <w:szCs w:val="22"/>
+        </w:rPr>
+        <w:t xml:space="preserve">instant</w:t>
+      </w:r>
+      <w:r>
+        <w:rPr>
+          <w:sz w:val="22"/>
+          <w:szCs w:val="22"/>
+        </w:rPr>
+        <w:t xml:space="preserve"> the button goes down. Hold X as long as you like and you get one True. Let go and press again for a second reading.</w:t>
+      </w:r>
+    </w:p>
+    <w:p>
+      <w:pPr>
+        <w:spacing w:after="120" w:line="276"/>
+      </w:pPr>
+      <w:r>
+        <w:rPr>
+          <w:sz w:val="22"/>
+          <w:szCs w:val="22"/>
+        </w:rPr>
+        <w:t xml:space="preserve">Both words work on both devices. </w:t>
+      </w:r>
+      <w:r>
+        <w:rPr>
+          <w:rFonts w:ascii="Roboto Mono" w:cs="Roboto Mono" w:eastAsia="Roboto Mono" w:hAnsi="Roboto Mono"/>
+          <w:sz w:val="19"/>
+          <w:szCs w:val="19"/>
+        </w:rPr>
+        <w:t xml:space="preserve">sb.held('ok')</w:t>
+      </w:r>
+      <w:r>
+        <w:rPr>
+          <w:sz w:val="22"/>
+          <w:szCs w:val="22"/>
+        </w:rPr>
+        <w:t xml:space="preserve"> and </w:t>
+      </w:r>
+      <w:r>
+        <w:rPr>
+          <w:rFonts w:ascii="Roboto Mono" w:cs="Roboto Mono" w:eastAsia="Roboto Mono" w:hAnsi="Roboto Mono"/>
+          <w:sz w:val="19"/>
+          <w:szCs w:val="19"/>
+        </w:rPr>
+        <w:t xml:space="preserve">sb.pressed('ok')</w:t>
+      </w:r>
+      <w:r>
+        <w:rPr>
+          <w:sz w:val="22"/>
+          <w:szCs w:val="22"/>
+        </w:rPr>
+        <w:t xml:space="preserve"> ask the same two questions of the robot's own pads.</w:t>
       </w:r>
     </w:p>
     <w:p>
@@ -908,19 +1466,31 @@
         <w:spacing w:after="120" w:before="260"/>
       </w:pPr>
       <w:r>
-        <w:t xml:space="preserve">5. Sticks and wheels speak different languages</w:t>
-      </w:r>
-    </w:p>
-    <w:p>
-      <w:pPr>
-        <w:spacing w:after="120" w:line="276"/>
-      </w:pPr>
-      <w:r>
-        <w:rPr>
-          <w:sz w:val="22"/>
-          <w:szCs w:val="22"/>
-        </w:rPr>
-        <w:t xml:space="preserve">The stick says +0.5. The motor has no idea what that means. Motors want RPM, which is rotations per minute. Ask for 70 and the wheel spins 70 times a minute.</w:t>
+        <w:t xml:space="preserve">Turning stick numbers into wheel speeds</w:t>
+      </w:r>
+    </w:p>
+    <w:p>
+      <w:pPr>
+        <w:spacing w:after="120" w:line="276"/>
+      </w:pPr>
+      <w:r>
+        <w:rPr>
+          <w:sz w:val="22"/>
+          <w:szCs w:val="22"/>
+        </w:rPr>
+        <w:t xml:space="preserve">Say you push the left stick halfway, get +0.5, and send that straight to the wheels. The robot barely twitches.</w:t>
+      </w:r>
+    </w:p>
+    <w:p>
+      <w:pPr>
+        <w:spacing w:after="120" w:line="276"/>
+      </w:pPr>
+      <w:r>
+        <w:rPr>
+          <w:sz w:val="22"/>
+          <w:szCs w:val="22"/>
+        </w:rPr>
+        <w:t xml:space="preserve">Nothing is broken. The motors do not measure speed the way sticks do. Motors want RPM, which is rotations per minute, and you just asked for half a rotation a minute.</w:t>
       </w:r>
     </w:p>
     <w:p>
@@ -1037,7 +1607,7 @@
         <w:spacing w:after="120" w:before="260"/>
       </w:pPr>
       <w:r>
-        <w:t xml:space="preserve">6. Sending the speeds to the wheels</w:t>
+        <w:t xml:space="preserve">Sending the speeds to the wheels</w:t>
       </w:r>
     </w:p>
     <w:p>
@@ -1146,7 +1716,7 @@
         <w:spacing w:after="120" w:before="260"/>
       </w:pPr>
       <w:r>
-        <w:t xml:space="preserve">7. The finally block, now with motors</w:t>
+        <w:t xml:space="preserve">Cleaning up when there are motors</w:t>
       </w:r>
     </w:p>
     <w:p>
@@ -1185,7 +1755,7 @@
           <w:sz w:val="22"/>
           <w:szCs w:val="22"/>
         </w:rPr>
-        <w:t xml:space="preserve">It matters more now. In P01 a crash left your lights stuck on. In this project a crash leaves the wheels spinning, and the robot drives off the table.</w:t>
+        <w:t xml:space="preserve">It matters more now. In P01 a crash left your lights stuck on, which is annoying. In this project a crash leaves the wheels spinning, and the robot drives itself off the table.</w:t>
       </w:r>
     </w:p>
     <w:p>
@@ -1284,260 +1854,7 @@
           <w:sz w:val="22"/>
           <w:szCs w:val="22"/>
         </w:rPr>
-        <w:t xml:space="preserve">The last line, </w:t>
-      </w:r>
-      <w:r>
-        <w:rPr>
-          <w:rFonts w:ascii="Roboto Mono" w:cs="Roboto Mono" w:eastAsia="Roboto Mono" w:hAnsi="Roboto Mono"/>
-          <w:sz w:val="19"/>
-          <w:szCs w:val="19"/>
-        </w:rPr>
-        <w:t xml:space="preserve">alvik.stop()</w:t>
-      </w:r>
-      <w:r>
-        <w:rPr>
-          <w:sz w:val="22"/>
-          <w:szCs w:val="22"/>
-        </w:rPr>
-        <w:t xml:space="preserve">, is already written for you. Leave it there. It shuts down the robot software and frees the WiFi network. Your cleanup goes above it.</w:t>
-      </w:r>
-    </w:p>
-    <w:p>
-      <w:pPr>
-        <w:pStyle w:val="Heading1"/>
-        <w:keepNext/>
-        <w:spacing w:after="160" w:before="340"/>
-      </w:pPr>
-      <w:r>
-        <w:t xml:space="preserve">Part 2: Do the work</w:t>
-      </w:r>
-    </w:p>
-    <w:p>
-      <w:pPr>
-        <w:pStyle w:val="Heading2"/>
-        <w:keepNext/>
-        <w:spacing w:after="120" w:before="260"/>
-      </w:pPr>
-      <w:r>
-        <w:t xml:space="preserve">Step 1: Set up</w:t>
-      </w:r>
-    </w:p>
-    <w:p>
-      <w:pPr>
-        <w:pStyle w:val="ListParagraph"/>
-        <w:numPr>
-          <w:ilvl w:val="0"/>
-          <w:numId w:val="3"/>
-        </w:numPr>
-        <w:spacing w:after="80" w:line="276"/>
-      </w:pPr>
-      <w:r>
-        <w:rPr>
-          <w:sz w:val="22"/>
-          <w:szCs w:val="22"/>
-        </w:rPr>
-        <w:t xml:space="preserve">Turn on your Alvik robot.</w:t>
-      </w:r>
-    </w:p>
-    <w:p>
-      <w:pPr>
-        <w:pStyle w:val="ListParagraph"/>
-        <w:numPr>
-          <w:ilvl w:val="0"/>
-          <w:numId w:val="3"/>
-        </w:numPr>
-        <w:spacing w:after="80" w:line="276"/>
-      </w:pPr>
-      <w:r>
-        <w:rPr>
-          <w:sz w:val="22"/>
-          <w:szCs w:val="22"/>
-        </w:rPr>
-        <w:t xml:space="preserve">Open </w:t>
-      </w:r>
-      <w:r>
-        <w:rPr>
-          <w:rFonts w:ascii="Roboto Mono" w:cs="Roboto Mono" w:eastAsia="Roboto Mono" w:hAnsi="Roboto Mono"/>
-          <w:sz w:val="19"/>
-          <w:szCs w:val="19"/>
-        </w:rPr>
-        <w:t xml:space="preserve">p03_gamepad_driving.py</w:t>
-      </w:r>
-      <w:r>
-        <w:rPr>
-          <w:sz w:val="22"/>
-          <w:szCs w:val="22"/>
-        </w:rPr>
-        <w:t xml:space="preserve"> in Thonny and save your own copy to the robot, as described at the top of this guide.</w:t>
-      </w:r>
-    </w:p>
-    <w:p>
-      <w:pPr>
-        <w:pStyle w:val="ListParagraph"/>
-        <w:numPr>
-          <w:ilvl w:val="0"/>
-          <w:numId w:val="3"/>
-        </w:numPr>
-        <w:spacing w:after="80" w:line="276"/>
-      </w:pPr>
-      <w:r>
-        <w:rPr>
-          <w:sz w:val="22"/>
-          <w:szCs w:val="22"/>
-        </w:rPr>
-        <w:t xml:space="preserve">Run the program. Thonny prints your robot's WiFi name in the Shell.</w:t>
-      </w:r>
-    </w:p>
-    <w:p>
-      <w:pPr>
-        <w:pStyle w:val="ListParagraph"/>
-        <w:numPr>
-          <w:ilvl w:val="0"/>
-          <w:numId w:val="3"/>
-        </w:numPr>
-        <w:spacing w:after="80" w:line="276"/>
-      </w:pPr>
-      <w:r>
-        <w:rPr>
-          <w:sz w:val="22"/>
-          <w:szCs w:val="22"/>
-        </w:rPr>
-        <w:t xml:space="preserve">Connect your Mac to that WiFi network. The password is </w:t>
-      </w:r>
-      <w:r>
-        <w:rPr>
-          <w:rFonts w:ascii="Roboto Mono" w:cs="Roboto Mono" w:eastAsia="Roboto Mono" w:hAnsi="Roboto Mono"/>
-          <w:sz w:val="19"/>
-          <w:szCs w:val="19"/>
-        </w:rPr>
-        <w:t xml:space="preserve">password</w:t>
-      </w:r>
-      <w:r>
-        <w:rPr>
-          <w:sz w:val="22"/>
-          <w:szCs w:val="22"/>
-        </w:rPr>
-        <w:t xml:space="preserve">.</w:t>
-      </w:r>
-    </w:p>
-    <w:p>
-      <w:pPr>
-        <w:pStyle w:val="ListParagraph"/>
-        <w:numPr>
-          <w:ilvl w:val="0"/>
-          <w:numId w:val="3"/>
-        </w:numPr>
-        <w:spacing w:after="80" w:line="276"/>
-      </w:pPr>
-      <w:r>
-        <w:rPr>
-          <w:sz w:val="22"/>
-          <w:szCs w:val="22"/>
-        </w:rPr>
-        <w:t xml:space="preserve">Open </w:t>
-      </w:r>
-      <w:r>
-        <w:rPr>
-          <w:rFonts w:ascii="Roboto Mono" w:cs="Roboto Mono" w:eastAsia="Roboto Mono" w:hAnsi="Roboto Mono"/>
-          <w:sz w:val="19"/>
-          <w:szCs w:val="19"/>
-        </w:rPr>
-        <w:t xml:space="preserve">http://192.168.4.1</w:t>
-      </w:r>
-      <w:r>
-        <w:rPr>
-          <w:sz w:val="22"/>
-          <w:szCs w:val="22"/>
-        </w:rPr>
-        <w:t xml:space="preserve"> in Chrome. Keep that Chrome window in front for the whole project. Chrome blocks gamepad input to any window that is not focused.</w:t>
-      </w:r>
-    </w:p>
-    <w:p>
-      <w:pPr>
-        <w:pStyle w:val="ListParagraph"/>
-        <w:numPr>
-          <w:ilvl w:val="0"/>
-          <w:numId w:val="3"/>
-        </w:numPr>
-        <w:spacing w:after="80" w:line="276"/>
-      </w:pPr>
-      <w:r>
-        <w:rPr>
-          <w:sz w:val="22"/>
-          <w:szCs w:val="22"/>
-        </w:rPr>
-        <w:t xml:space="preserve">Pair your PS5 controller to the Mac over Bluetooth. The robot's LEDs turn green when it connects.</w:t>
-      </w:r>
-    </w:p>
-    <w:p>
-      <w:pPr>
-        <w:pStyle w:val="ListParagraph"/>
-        <w:numPr>
-          <w:ilvl w:val="0"/>
-          <w:numId w:val="3"/>
-        </w:numPr>
-        <w:spacing w:after="80" w:line="276"/>
-      </w:pPr>
-      <w:r>
-        <w:rPr>
-          <w:sz w:val="22"/>
-          <w:szCs w:val="22"/>
-        </w:rPr>
-        <w:t xml:space="preserve">Put the robot on the floor. Not on a table.</w:t>
-      </w:r>
-    </w:p>
-    <w:p>
-      <w:pPr>
-        <w:spacing w:after="60"/>
-      </w:pPr>
-    </w:p>
-    <w:p>
-      <w:pPr>
-        <w:pStyle w:val="Heading2"/>
-        <w:keepNext/>
-        <w:spacing w:after="120" w:before="260"/>
-      </w:pPr>
-      <w:r>
-        <w:t xml:space="preserve">Step 2: Write your code</w:t>
-      </w:r>
-    </w:p>
-    <w:p>
-      <w:pPr>
-        <w:spacing w:after="120" w:line="276"/>
-      </w:pPr>
-      <w:r>
-        <w:rPr>
-          <w:sz w:val="22"/>
-          <w:szCs w:val="22"/>
-        </w:rPr>
-        <w:t xml:space="preserve">Look for the </w:t>
-      </w:r>
-      <w:r>
-        <w:rPr>
-          <w:rFonts w:ascii="Roboto Mono" w:cs="Roboto Mono" w:eastAsia="Roboto Mono" w:hAnsi="Roboto Mono"/>
-          <w:sz w:val="19"/>
-          <w:szCs w:val="19"/>
-        </w:rPr>
-        <w:t xml:space="preserve"># WORK</w:t>
-      </w:r>
-      <w:r>
-        <w:rPr>
-          <w:sz w:val="22"/>
-          <w:szCs w:val="22"/>
-        </w:rPr>
-        <w:t xml:space="preserve"> comments in your Python file. Do them in order.</w:t>
-      </w:r>
-    </w:p>
-    <w:p>
-      <w:pPr>
-        <w:spacing w:after="120" w:line="276"/>
-      </w:pPr>
-      <w:r>
-        <w:rPr>
-          <w:sz w:val="22"/>
-          <w:szCs w:val="22"/>
-        </w:rPr>
-        <w:t xml:space="preserve">WORK 1 is looking before driving. Inside the loop, print both stick values when X is pressed:</w:t>
+        <w:t xml:space="preserve">There is one more thing to put right. Back at the top, when the gamepad connected, it turned both lights green to tell you so. Nothing in this project ever changes them again, so they are still green when you quit. Clear them with the power you met in P02:</w:t>
       </w:r>
     </w:p>
     <w:tbl>
@@ -1585,7 +1902,335 @@
                 <w:sz w:val="19"/>
                 <w:szCs w:val="19"/>
               </w:rPr>
-              <w:t xml:space="preserve">if btn_x.is_pressed():</w:t>
+              <w:t xml:space="preserve">sb.light_both_leds(0, 0, 0)</w:t>
+            </w:r>
+          </w:p>
+        </w:tc>
+      </w:tr>
+    </w:tbl>
+    <w:p>
+      <w:pPr>
+        <w:spacing w:after="60" w:line="120"/>
+      </w:pPr>
+      <w:r>
+        <w:rPr>
+          <w:sz w:val="8"/>
+          <w:szCs w:val="8"/>
+        </w:rPr>
+        <w:t xml:space="preserve"/>
+      </w:r>
+    </w:p>
+    <w:p>
+      <w:pPr>
+        <w:spacing w:after="120" w:line="276"/>
+      </w:pPr>
+      <w:r>
+        <w:rPr>
+          <w:sz w:val="22"/>
+          <w:szCs w:val="22"/>
+        </w:rPr>
+        <w:t xml:space="preserve">The last line, </w:t>
+      </w:r>
+      <w:r>
+        <w:rPr>
+          <w:rFonts w:ascii="Roboto Mono" w:cs="Roboto Mono" w:eastAsia="Roboto Mono" w:hAnsi="Roboto Mono"/>
+          <w:sz w:val="19"/>
+          <w:szCs w:val="19"/>
+        </w:rPr>
+        <w:t xml:space="preserve">alvik.stop()</w:t>
+      </w:r>
+      <w:r>
+        <w:rPr>
+          <w:sz w:val="22"/>
+          <w:szCs w:val="22"/>
+        </w:rPr>
+        <w:t xml:space="preserve">, is already written for you. Leave it there. Both of your cleanup lines go above it.</w:t>
+      </w:r>
+    </w:p>
+    <w:p>
+      <w:pPr>
+        <w:pStyle w:val="Heading1"/>
+        <w:keepNext/>
+        <w:spacing w:after="160" w:before="340"/>
+      </w:pPr>
+      <w:r>
+        <w:t xml:space="preserve">Part 2: Do the work</w:t>
+      </w:r>
+    </w:p>
+    <w:p>
+      <w:pPr>
+        <w:pStyle w:val="Heading2"/>
+        <w:keepNext/>
+        <w:spacing w:after="120" w:before="260"/>
+      </w:pPr>
+      <w:r>
+        <w:t xml:space="preserve">Step 1: Set up</w:t>
+      </w:r>
+    </w:p>
+    <w:p>
+      <w:pPr>
+        <w:pStyle w:val="ListParagraph"/>
+        <w:numPr>
+          <w:ilvl w:val="0"/>
+          <w:numId w:val="3"/>
+        </w:numPr>
+        <w:spacing w:after="80" w:line="276"/>
+      </w:pPr>
+      <w:r>
+        <w:rPr>
+          <w:sz w:val="22"/>
+          <w:szCs w:val="22"/>
+        </w:rPr>
+        <w:t xml:space="preserve">Turn on your Alvik robot.</w:t>
+      </w:r>
+    </w:p>
+    <w:p>
+      <w:pPr>
+        <w:pStyle w:val="ListParagraph"/>
+        <w:numPr>
+          <w:ilvl w:val="0"/>
+          <w:numId w:val="3"/>
+        </w:numPr>
+        <w:spacing w:after="80" w:line="276"/>
+      </w:pPr>
+      <w:r>
+        <w:rPr>
+          <w:sz w:val="22"/>
+          <w:szCs w:val="22"/>
+        </w:rPr>
+        <w:t xml:space="preserve">Open </w:t>
+      </w:r>
+      <w:r>
+        <w:rPr>
+          <w:rFonts w:ascii="Roboto Mono" w:cs="Roboto Mono" w:eastAsia="Roboto Mono" w:hAnsi="Roboto Mono"/>
+          <w:sz w:val="19"/>
+          <w:szCs w:val="19"/>
+        </w:rPr>
+        <w:t xml:space="preserve">p03_gamepad_driving.py</w:t>
+      </w:r>
+      <w:r>
+        <w:rPr>
+          <w:sz w:val="22"/>
+          <w:szCs w:val="22"/>
+        </w:rPr>
+        <w:t xml:space="preserve"> in Thonny and save your own copy to the robot, as described at the top of this guide.</w:t>
+      </w:r>
+    </w:p>
+    <w:p>
+      <w:pPr>
+        <w:pStyle w:val="ListParagraph"/>
+        <w:numPr>
+          <w:ilvl w:val="0"/>
+          <w:numId w:val="3"/>
+        </w:numPr>
+        <w:spacing w:after="80" w:line="276"/>
+      </w:pPr>
+      <w:r>
+        <w:rPr>
+          <w:sz w:val="22"/>
+          <w:szCs w:val="22"/>
+        </w:rPr>
+        <w:t xml:space="preserve">Run the program. Thonny prints your robot's WiFi name in the Shell.</w:t>
+      </w:r>
+    </w:p>
+    <w:p>
+      <w:pPr>
+        <w:pStyle w:val="ListParagraph"/>
+        <w:numPr>
+          <w:ilvl w:val="0"/>
+          <w:numId w:val="3"/>
+        </w:numPr>
+        <w:spacing w:after="80" w:line="276"/>
+      </w:pPr>
+      <w:r>
+        <w:rPr>
+          <w:sz w:val="22"/>
+          <w:szCs w:val="22"/>
+        </w:rPr>
+        <w:t xml:space="preserve">Connect your Mac to that WiFi network. The password is </w:t>
+      </w:r>
+      <w:r>
+        <w:rPr>
+          <w:rFonts w:ascii="Roboto Mono" w:cs="Roboto Mono" w:eastAsia="Roboto Mono" w:hAnsi="Roboto Mono"/>
+          <w:sz w:val="19"/>
+          <w:szCs w:val="19"/>
+        </w:rPr>
+        <w:t xml:space="preserve">password</w:t>
+      </w:r>
+      <w:r>
+        <w:rPr>
+          <w:sz w:val="22"/>
+          <w:szCs w:val="22"/>
+        </w:rPr>
+        <w:t xml:space="preserve">.</w:t>
+      </w:r>
+    </w:p>
+    <w:p>
+      <w:pPr>
+        <w:pStyle w:val="ListParagraph"/>
+        <w:numPr>
+          <w:ilvl w:val="0"/>
+          <w:numId w:val="3"/>
+        </w:numPr>
+        <w:spacing w:after="80" w:line="276"/>
+      </w:pPr>
+      <w:r>
+        <w:rPr>
+          <w:sz w:val="22"/>
+          <w:szCs w:val="22"/>
+        </w:rPr>
+        <w:t xml:space="preserve">Open </w:t>
+      </w:r>
+      <w:r>
+        <w:rPr>
+          <w:rFonts w:ascii="Roboto Mono" w:cs="Roboto Mono" w:eastAsia="Roboto Mono" w:hAnsi="Roboto Mono"/>
+          <w:sz w:val="19"/>
+          <w:szCs w:val="19"/>
+        </w:rPr>
+        <w:t xml:space="preserve">http://192.168.4.1</w:t>
+      </w:r>
+      <w:r>
+        <w:rPr>
+          <w:sz w:val="22"/>
+          <w:szCs w:val="22"/>
+        </w:rPr>
+        <w:t xml:space="preserve"> in Chrome. Keep that Chrome window in front for the whole project. Chrome blocks gamepad input to any window that is not focused.</w:t>
+      </w:r>
+    </w:p>
+    <w:p>
+      <w:pPr>
+        <w:pStyle w:val="ListParagraph"/>
+        <w:numPr>
+          <w:ilvl w:val="0"/>
+          <w:numId w:val="3"/>
+        </w:numPr>
+        <w:spacing w:after="80" w:line="276"/>
+      </w:pPr>
+      <w:r>
+        <w:rPr>
+          <w:sz w:val="22"/>
+          <w:szCs w:val="22"/>
+        </w:rPr>
+        <w:t xml:space="preserve">Pair your PS5 controller to the Mac over Bluetooth. The robot's LEDs turn green when it connects.</w:t>
+      </w:r>
+    </w:p>
+    <w:p>
+      <w:pPr>
+        <w:pStyle w:val="ListParagraph"/>
+        <w:numPr>
+          <w:ilvl w:val="0"/>
+          <w:numId w:val="3"/>
+        </w:numPr>
+        <w:spacing w:after="80" w:line="276"/>
+      </w:pPr>
+      <w:r>
+        <w:rPr>
+          <w:sz w:val="22"/>
+          <w:szCs w:val="22"/>
+        </w:rPr>
+        <w:t xml:space="preserve">Put the robot on the floor. Not on a table.</w:t>
+      </w:r>
+    </w:p>
+    <w:p>
+      <w:pPr>
+        <w:spacing w:after="60"/>
+      </w:pPr>
+    </w:p>
+    <w:p>
+      <w:pPr>
+        <w:pStyle w:val="Heading2"/>
+        <w:keepNext/>
+        <w:spacing w:after="120" w:before="260"/>
+      </w:pPr>
+      <w:r>
+        <w:t xml:space="preserve">Step 2: Type in WORK 1</w:t>
+      </w:r>
+    </w:p>
+    <w:p>
+      <w:pPr>
+        <w:spacing w:after="120" w:line="276"/>
+      </w:pPr>
+      <w:r>
+        <w:rPr>
+          <w:sz w:val="22"/>
+          <w:szCs w:val="22"/>
+        </w:rPr>
+        <w:t xml:space="preserve">Look before you drive. These two lines print both stick values, once, each time you press X.</w:t>
+      </w:r>
+    </w:p>
+    <w:p>
+      <w:pPr>
+        <w:spacing w:after="120" w:line="276"/>
+      </w:pPr>
+      <w:r>
+        <w:rPr>
+          <w:sz w:val="22"/>
+          <w:szCs w:val="22"/>
+        </w:rPr>
+        <w:t xml:space="preserve">Find the </w:t>
+      </w:r>
+      <w:r>
+        <w:rPr>
+          <w:rFonts w:ascii="Roboto Mono" w:cs="Roboto Mono" w:eastAsia="Roboto Mono" w:hAnsi="Roboto Mono"/>
+          <w:sz w:val="19"/>
+          <w:szCs w:val="19"/>
+        </w:rPr>
+        <w:t xml:space="preserve"># WORK 1</w:t>
+      </w:r>
+      <w:r>
+        <w:rPr>
+          <w:sz w:val="22"/>
+          <w:szCs w:val="22"/>
+        </w:rPr>
+        <w:t xml:space="preserve"> comment and type them underneath it:</w:t>
+      </w:r>
+    </w:p>
+    <w:tbl>
+      <w:tblPr>
+        <w:tblW w:type="dxa" w:w="9360"/>
+        <w:tblBorders>
+          <w:top w:val="single" w:color="auto" w:sz="4"/>
+          <w:left w:val="single" w:color="auto" w:sz="4"/>
+          <w:bottom w:val="single" w:color="auto" w:sz="4"/>
+          <w:right w:val="single" w:color="auto" w:sz="4"/>
+          <w:insideH w:val="single" w:color="auto" w:sz="4"/>
+          <w:insideV w:val="single" w:color="auto" w:sz="4"/>
+        </w:tblBorders>
+      </w:tblPr>
+      <w:tblGrid>
+        <w:gridCol w:w="9360"/>
+      </w:tblGrid>
+      <w:tr>
+        <w:trPr>
+          <w:cantSplit/>
+        </w:trPr>
+        <w:tc>
+          <w:tcPr>
+            <w:tcW w:type="dxa" w:w="9360"/>
+            <w:tcBorders>
+              <w:top w:val="single" w:color="9A9A9A" w:sz="4"/>
+              <w:left w:val="single" w:color="9A9A9A" w:sz="4"/>
+              <w:bottom w:val="single" w:color="9A9A9A" w:sz="4"/>
+              <w:right w:val="single" w:color="9A9A9A" w:sz="4"/>
+            </w:tcBorders>
+            <w:tcMar>
+              <w:top w:type="dxa" w:w="120"/>
+              <w:left w:type="dxa" w:w="180"/>
+              <w:bottom w:type="dxa" w:w="120"/>
+              <w:right w:type="dxa" w:w="180"/>
+            </w:tcMar>
+          </w:tcPr>
+          <w:p>
+            <w:pPr>
+              <w:spacing w:after="0" w:line="240"/>
+            </w:pPr>
+            <w:r>
+              <w:rPr>
+                <w:rFonts w:ascii="Roboto Mono" w:cs="Roboto Mono" w:eastAsia="Roboto Mono" w:hAnsi="Roboto Mono"/>
+                <w:sz w:val="19"/>
+                <w:szCs w:val="19"/>
+              </w:rPr>
+              <w:t xml:space="preserve">if gamepad.pressed('cross'):</w:t>
             </w:r>
           </w:p>
           <w:p>
@@ -1625,19 +2270,68 @@
           <w:sz w:val="22"/>
           <w:szCs w:val="22"/>
         </w:rPr>
-        <w:t xml:space="preserve">Now run it and read the numbers. Push a stick all the way and press X. Push it halfway and press X. Let go and press X. Write down all three. You should see the full push land near 1.0, the half push near 0.5, and the centered stick sit at exactly 0.0.</w:t>
-      </w:r>
-    </w:p>
-    <w:p>
-      <w:pPr>
-        <w:spacing w:after="120" w:line="276"/>
-      </w:pPr>
-      <w:r>
-        <w:rPr>
-          <w:sz w:val="22"/>
-          <w:szCs w:val="22"/>
-        </w:rPr>
-        <w:t xml:space="preserve">WORK 2 is the driving, and it is three lines. Turn each stick value into a wheel speed, then send both:</w:t>
+        <w:t xml:space="preserve">Run it. Push a stick all the way and press X. Push it halfway and press X. Let go and press X. Write all three readings down.</w:t>
+      </w:r>
+    </w:p>
+    <w:p>
+      <w:pPr>
+        <w:spacing w:after="120" w:line="276"/>
+      </w:pPr>
+      <w:r>
+        <w:rPr>
+          <w:sz w:val="22"/>
+          <w:szCs w:val="22"/>
+        </w:rPr>
+        <w:t xml:space="preserve">You should see the full push land near 1.0, the half push near 0.5, and the centered stick sit at exactly 0.0.</w:t>
+      </w:r>
+    </w:p>
+    <w:p>
+      <w:pPr>
+        <w:pStyle w:val="Heading2"/>
+        <w:keepNext/>
+        <w:spacing w:after="120" w:before="260"/>
+      </w:pPr>
+      <w:r>
+        <w:t xml:space="preserve">Step 3: Type in WORK 2</w:t>
+      </w:r>
+    </w:p>
+    <w:p>
+      <w:pPr>
+        <w:spacing w:after="120" w:line="276"/>
+      </w:pPr>
+      <w:r>
+        <w:rPr>
+          <w:sz w:val="22"/>
+          <w:szCs w:val="22"/>
+        </w:rPr>
+        <w:t xml:space="preserve">Now the driving. Two lines of math, then one line that sends it.</w:t>
+      </w:r>
+    </w:p>
+    <w:p>
+      <w:pPr>
+        <w:spacing w:after="120" w:line="276"/>
+      </w:pPr>
+      <w:r>
+        <w:rPr>
+          <w:sz w:val="22"/>
+          <w:szCs w:val="22"/>
+        </w:rPr>
+        <w:t xml:space="preserve">Find the </w:t>
+      </w:r>
+      <w:r>
+        <w:rPr>
+          <w:rFonts w:ascii="Roboto Mono" w:cs="Roboto Mono" w:eastAsia="Roboto Mono" w:hAnsi="Roboto Mono"/>
+          <w:sz w:val="19"/>
+          <w:szCs w:val="19"/>
+        </w:rPr>
+        <w:t xml:space="preserve"># WORK 2</w:t>
+      </w:r>
+      <w:r>
+        <w:rPr>
+          <w:sz w:val="22"/>
+          <w:szCs w:val="22"/>
+        </w:rPr>
+        <w:t xml:space="preserve"> comment and type these underneath it:</w:t>
       </w:r>
     </w:p>
     <w:tbl>
@@ -1738,19 +2432,41 @@
           <w:sz w:val="22"/>
           <w:szCs w:val="22"/>
         </w:rPr>
-        <w:t xml:space="preserve">Drive it. Straight, curving, spinning in place, backward.</w:t>
-      </w:r>
-    </w:p>
-    <w:p>
-      <w:pPr>
-        <w:spacing w:after="120" w:line="276"/>
-      </w:pPr>
-      <w:r>
-        <w:rPr>
-          <w:sz w:val="22"/>
-          <w:szCs w:val="22"/>
-        </w:rPr>
-        <w:t xml:space="preserve">WORK 3 is the cleanup, inside </w:t>
+        <w:t xml:space="preserve">Run it and drive. Straight, curving, spinning in place, backward. Your WORK 1 readings still print whenever you press X.</w:t>
+      </w:r>
+    </w:p>
+    <w:p>
+      <w:pPr>
+        <w:pStyle w:val="Heading2"/>
+        <w:keepNext/>
+        <w:spacing w:after="120" w:before="260"/>
+      </w:pPr>
+      <w:r>
+        <w:t xml:space="preserve">Step 4: Type in WORK 3</w:t>
+      </w:r>
+    </w:p>
+    <w:p>
+      <w:pPr>
+        <w:spacing w:after="120" w:line="276"/>
+      </w:pPr>
+      <w:r>
+        <w:rPr>
+          <w:sz w:val="22"/>
+          <w:szCs w:val="22"/>
+        </w:rPr>
+        <w:t xml:space="preserve">This is the shutdown, and with motors it is the part that keeps your robot on the table.</w:t>
+      </w:r>
+    </w:p>
+    <w:p>
+      <w:pPr>
+        <w:spacing w:after="120" w:line="276"/>
+      </w:pPr>
+      <w:r>
+        <w:rPr>
+          <w:sz w:val="22"/>
+          <w:szCs w:val="22"/>
+        </w:rPr>
+        <w:t xml:space="preserve">Find the </w:t>
       </w:r>
       <w:r>
         <w:rPr>
@@ -1758,14 +2474,14 @@
           <w:sz w:val="19"/>
           <w:szCs w:val="19"/>
         </w:rPr>
-        <w:t xml:space="preserve">finally:</w:t>
-      </w:r>
-      <w:r>
-        <w:rPr>
-          <w:sz w:val="22"/>
-          <w:szCs w:val="22"/>
-        </w:rPr>
-        <w:t xml:space="preserve">. Two things, both above the </w:t>
+        <w:t xml:space="preserve"># WORK 3</w:t>
+      </w:r>
+      <w:r>
+        <w:rPr>
+          <w:sz w:val="22"/>
+          <w:szCs w:val="22"/>
+        </w:rPr>
+        <w:t xml:space="preserve"> comment, inside </w:t>
       </w:r>
       <w:r>
         <w:rPr>
@@ -1773,6 +2489,21 @@
           <w:sz w:val="19"/>
           <w:szCs w:val="19"/>
         </w:rPr>
+        <w:t xml:space="preserve">finally:</w:t>
+      </w:r>
+      <w:r>
+        <w:rPr>
+          <w:sz w:val="22"/>
+          <w:szCs w:val="22"/>
+        </w:rPr>
+        <w:t xml:space="preserve">, and type these underneath it. They go above the </w:t>
+      </w:r>
+      <w:r>
+        <w:rPr>
+          <w:rFonts w:ascii="Roboto Mono" w:cs="Roboto Mono" w:eastAsia="Roboto Mono" w:hAnsi="Roboto Mono"/>
+          <w:sz w:val="19"/>
+          <w:szCs w:val="19"/>
+        </w:rPr>
         <w:t xml:space="preserve">alvik.stop()</w:t>
       </w:r>
       <w:r>
@@ -1780,7 +2511,205 @@
           <w:sz w:val="22"/>
           <w:szCs w:val="22"/>
         </w:rPr>
-        <w:t xml:space="preserve"> line.</w:t>
+        <w:t xml:space="preserve"> line that is already there:</w:t>
+      </w:r>
+    </w:p>
+    <w:tbl>
+      <w:tblPr>
+        <w:tblW w:type="dxa" w:w="9360"/>
+        <w:tblBorders>
+          <w:top w:val="single" w:color="auto" w:sz="4"/>
+          <w:left w:val="single" w:color="auto" w:sz="4"/>
+          <w:bottom w:val="single" w:color="auto" w:sz="4"/>
+          <w:right w:val="single" w:color="auto" w:sz="4"/>
+          <w:insideH w:val="single" w:color="auto" w:sz="4"/>
+          <w:insideV w:val="single" w:color="auto" w:sz="4"/>
+        </w:tblBorders>
+      </w:tblPr>
+      <w:tblGrid>
+        <w:gridCol w:w="9360"/>
+      </w:tblGrid>
+      <w:tr>
+        <w:trPr>
+          <w:cantSplit/>
+        </w:trPr>
+        <w:tc>
+          <w:tcPr>
+            <w:tcW w:type="dxa" w:w="9360"/>
+            <w:tcBorders>
+              <w:top w:val="single" w:color="9A9A9A" w:sz="4"/>
+              <w:left w:val="single" w:color="9A9A9A" w:sz="4"/>
+              <w:bottom w:val="single" w:color="9A9A9A" w:sz="4"/>
+              <w:right w:val="single" w:color="9A9A9A" w:sz="4"/>
+            </w:tcBorders>
+            <w:tcMar>
+              <w:top w:type="dxa" w:w="120"/>
+              <w:left w:type="dxa" w:w="180"/>
+              <w:bottom w:type="dxa" w:w="120"/>
+              <w:right w:type="dxa" w:w="180"/>
+            </w:tcMar>
+          </w:tcPr>
+          <w:p>
+            <w:pPr>
+              <w:spacing w:after="0" w:line="240"/>
+            </w:pPr>
+            <w:r>
+              <w:rPr>
+                <w:rFonts w:ascii="Roboto Mono" w:cs="Roboto Mono" w:eastAsia="Roboto Mono" w:hAnsi="Roboto Mono"/>
+                <w:sz w:val="19"/>
+                <w:szCs w:val="19"/>
+              </w:rPr>
+              <w:t xml:space="preserve">alvik.brake()</w:t>
+            </w:r>
+          </w:p>
+          <w:p>
+            <w:pPr>
+              <w:spacing w:after="0" w:line="240"/>
+            </w:pPr>
+            <w:r>
+              <w:rPr>
+                <w:rFonts w:ascii="Roboto Mono" w:cs="Roboto Mono" w:eastAsia="Roboto Mono" w:hAnsi="Roboto Mono"/>
+                <w:sz w:val="19"/>
+                <w:szCs w:val="19"/>
+              </w:rPr>
+              <w:t xml:space="preserve">sb.light_both_leds(0, 0, 0)</w:t>
+            </w:r>
+          </w:p>
+        </w:tc>
+      </w:tr>
+    </w:tbl>
+    <w:p>
+      <w:pPr>
+        <w:spacing w:after="60" w:line="120"/>
+      </w:pPr>
+      <w:r>
+        <w:rPr>
+          <w:sz w:val="8"/>
+          <w:szCs w:val="8"/>
+        </w:rPr>
+        <w:t xml:space="preserve"/>
+      </w:r>
+    </w:p>
+    <w:p>
+      <w:pPr>
+        <w:spacing w:after="120" w:line="276"/>
+      </w:pPr>
+      <w:r>
+        <w:rPr>
+          <w:sz w:val="22"/>
+          <w:szCs w:val="22"/>
+        </w:rPr>
+        <w:t xml:space="preserve">Test it by pressing Options while the robot is rolling. The wheels should stop right where they are.</w:t>
+      </w:r>
+    </w:p>
+    <w:p>
+      <w:pPr>
+        <w:pStyle w:val="Heading2"/>
+        <w:keepNext/>
+        <w:spacing w:after="120" w:before="260"/>
+      </w:pPr>
+      <w:r>
+        <w:t xml:space="preserve">Step 5: Worksheet and check off</w:t>
+      </w:r>
+    </w:p>
+    <w:p>
+      <w:pPr>
+        <w:spacing w:after="120" w:line="276"/>
+      </w:pPr>
+      <w:r>
+        <w:rPr>
+          <w:sz w:val="22"/>
+          <w:szCs w:val="22"/>
+        </w:rPr>
+        <w:t xml:space="preserve">One run shows all of it. Press X a few times and read your numbers out of the Shell, then drive forward, back up, spin in place, and press Options to stop clean.</w:t>
+      </w:r>
+    </w:p>
+    <w:p>
+      <w:pPr>
+        <w:spacing w:after="120" w:line="276"/>
+      </w:pPr>
+      <w:r>
+        <w:rPr>
+          <w:sz w:val="22"/>
+          <w:szCs w:val="22"/>
+        </w:rPr>
+        <w:t xml:space="preserve">Part A of the worksheet has three WORK boxes and a FLEX box. Those match the </w:t>
+      </w:r>
+      <w:r>
+        <w:rPr>
+          <w:rFonts w:ascii="Roboto Mono" w:cs="Roboto Mono" w:eastAsia="Roboto Mono" w:hAnsi="Roboto Mono"/>
+          <w:sz w:val="19"/>
+          <w:szCs w:val="19"/>
+        </w:rPr>
+        <w:t xml:space="preserve"># WORK</w:t>
+      </w:r>
+      <w:r>
+        <w:rPr>
+          <w:sz w:val="22"/>
+          <w:szCs w:val="22"/>
+        </w:rPr>
+        <w:t xml:space="preserve"> and </w:t>
+      </w:r>
+      <w:r>
+        <w:rPr>
+          <w:rFonts w:ascii="Roboto Mono" w:cs="Roboto Mono" w:eastAsia="Roboto Mono" w:hAnsi="Roboto Mono"/>
+          <w:sz w:val="19"/>
+          <w:szCs w:val="19"/>
+        </w:rPr>
+        <w:t xml:space="preserve"># FLEX</w:t>
+      </w:r>
+      <w:r>
+        <w:rPr>
+          <w:sz w:val="22"/>
+          <w:szCs w:val="22"/>
+        </w:rPr>
+        <w:t xml:space="preserve"> comments in your Python file. Copy the key line or lines from each one into its box. If you skipped the flex, leave the FLEX box empty.</w:t>
+      </w:r>
+    </w:p>
+    <w:p>
+      <w:pPr>
+        <w:spacing w:after="120" w:line="276"/>
+      </w:pPr>
+      <w:r>
+        <w:rPr>
+          <w:sz w:val="22"/>
+          <w:szCs w:val="22"/>
+        </w:rPr>
+        <w:t xml:space="preserve">One checkoff. Run the finished file once and it shows everything you built, so nothing gets commented out along the way. The work is 19 points, the flex is 20, undone is 0. Late is your points × 0.9. No robot or no worksheet is a 0 and a redo. Work at your own speed and watch the due dates. Finish all fourteen and the Lego and servo bin unlocks.</w:t>
+      </w:r>
+    </w:p>
+    <w:p>
+      <w:pPr>
+        <w:pStyle w:val="Heading2"/>
+        <w:keepNext/>
+        <w:spacing w:after="120" w:before="260"/>
+      </w:pPr>
+      <w:r>
+        <w:t xml:space="preserve">FLEX: The A+</w:t>
+      </w:r>
+    </w:p>
+    <w:p>
+      <w:pPr>
+        <w:spacing w:after="120" w:line="276"/>
+      </w:pPr>
+      <w:r>
+        <w:rPr>
+          <w:sz w:val="22"/>
+          <w:szCs w:val="22"/>
+        </w:rPr>
+        <w:t xml:space="preserve">This one is not printed anywhere. You work it out.</w:t>
+      </w:r>
+    </w:p>
+    <w:p>
+      <w:pPr>
+        <w:spacing w:after="120" w:line="276"/>
+      </w:pPr>
+      <w:r>
+        <w:rPr>
+          <w:sz w:val="22"/>
+          <w:szCs w:val="22"/>
+        </w:rPr>
+        <w:t xml:space="preserve">Make each LED report on its own wheel.</w:t>
       </w:r>
     </w:p>
     <w:p>
@@ -1797,22 +2726,7 @@
           <w:sz w:val="22"/>
           <w:szCs w:val="22"/>
         </w:rPr>
-        <w:t xml:space="preserve">Call </w:t>
-      </w:r>
-      <w:r>
-        <w:rPr>
-          <w:rFonts w:ascii="Roboto Mono" w:cs="Roboto Mono" w:eastAsia="Roboto Mono" w:hAnsi="Roboto Mono"/>
-          <w:sz w:val="19"/>
-          <w:szCs w:val="19"/>
-        </w:rPr>
-        <w:t xml:space="preserve">alvik.brake()</w:t>
-      </w:r>
-      <w:r>
-        <w:rPr>
-          <w:sz w:val="22"/>
-          <w:szCs w:val="22"/>
-        </w:rPr>
-        <w:t xml:space="preserve">.</w:t>
+        <w:t xml:space="preserve">That wheel going forward: the LED on that side is green.</w:t>
       </w:r>
     </w:p>
     <w:p>
@@ -1829,122 +2743,7 @@
           <w:sz w:val="22"/>
           <w:szCs w:val="22"/>
         </w:rPr>
-        <w:t xml:space="preserve">Turn both LEDs off.</w:t>
-      </w:r>
-    </w:p>
-    <w:p>
-      <w:pPr>
-        <w:spacing w:after="60"/>
-      </w:pPr>
-    </w:p>
-    <w:p>
-      <w:pPr>
-        <w:spacing w:after="120" w:line="276"/>
-      </w:pPr>
-      <w:r>
-        <w:rPr>
-          <w:sz w:val="22"/>
-          <w:szCs w:val="22"/>
-        </w:rPr>
-        <w:t xml:space="preserve">Test it by pressing Options while the robot is rolling. The wheels should stop right where they are.</w:t>
-      </w:r>
-    </w:p>
-    <w:p>
-      <w:pPr>
-        <w:pStyle w:val="Heading2"/>
-        <w:keepNext/>
-        <w:spacing w:after="120" w:before="260"/>
-      </w:pPr>
-      <w:r>
-        <w:t xml:space="preserve">Step 3: Worksheet and check off</w:t>
-      </w:r>
-    </w:p>
-    <w:p>
-      <w:pPr>
-        <w:spacing w:after="120" w:line="276"/>
-      </w:pPr>
-      <w:r>
-        <w:rPr>
-          <w:sz w:val="22"/>
-          <w:szCs w:val="22"/>
-        </w:rPr>
-        <w:t xml:space="preserve">One run shows all of it. Press X a few times and read your numbers out of the Shell, then drive forward, back up, spin in place, and press Options to stop clean.</w:t>
-      </w:r>
-    </w:p>
-    <w:p>
-      <w:pPr>
-        <w:spacing w:after="120" w:line="276"/>
-      </w:pPr>
-      <w:r>
-        <w:rPr>
-          <w:sz w:val="22"/>
-          <w:szCs w:val="22"/>
-        </w:rPr>
-        <w:t xml:space="preserve">Part A of the worksheet has three WORK boxes and a FLEX box. Those match the </w:t>
-      </w:r>
-      <w:r>
-        <w:rPr>
-          <w:rFonts w:ascii="Roboto Mono" w:cs="Roboto Mono" w:eastAsia="Roboto Mono" w:hAnsi="Roboto Mono"/>
-          <w:sz w:val="19"/>
-          <w:szCs w:val="19"/>
-        </w:rPr>
-        <w:t xml:space="preserve"># WORK</w:t>
-      </w:r>
-      <w:r>
-        <w:rPr>
-          <w:sz w:val="22"/>
-          <w:szCs w:val="22"/>
-        </w:rPr>
-        <w:t xml:space="preserve"> and </w:t>
-      </w:r>
-      <w:r>
-        <w:rPr>
-          <w:rFonts w:ascii="Roboto Mono" w:cs="Roboto Mono" w:eastAsia="Roboto Mono" w:hAnsi="Roboto Mono"/>
-          <w:sz w:val="19"/>
-          <w:szCs w:val="19"/>
-        </w:rPr>
-        <w:t xml:space="preserve"># FLEX</w:t>
-      </w:r>
-      <w:r>
-        <w:rPr>
-          <w:sz w:val="22"/>
-          <w:szCs w:val="22"/>
-        </w:rPr>
-        <w:t xml:space="preserve"> comments in your Python file. Copy the key line or lines from each one into its box. If you skipped the flex, leave the FLEX box empty.</w:t>
-      </w:r>
-    </w:p>
-    <w:p>
-      <w:pPr>
-        <w:spacing w:after="120" w:line="276"/>
-      </w:pPr>
-      <w:r>
-        <w:rPr>
-          <w:sz w:val="22"/>
-          <w:szCs w:val="22"/>
-        </w:rPr>
-        <w:t xml:space="preserve">One checkoff. Run the finished file once and it shows everything you built, so nothing gets commented out along the way. The work is 19 points, the flex is 20, undone is 0. Late is your points × 0.9. No robot or no worksheet is a 0 and a redo. Work at your own speed and watch the due dates. Finish all fourteen and the Lego and servo bin unlocks.</w:t>
-      </w:r>
-    </w:p>
-    <w:p>
-      <w:pPr>
-        <w:pStyle w:val="Heading2"/>
-        <w:keepNext/>
-        <w:spacing w:after="120" w:before="260"/>
-      </w:pPr>
-      <w:r>
-        <w:t xml:space="preserve">FLEX: The A+</w:t>
-      </w:r>
-    </w:p>
-    <w:p>
-      <w:pPr>
-        <w:spacing w:after="120" w:line="276"/>
-      </w:pPr>
-      <w:r>
-        <w:rPr>
-          <w:sz w:val="22"/>
-          <w:szCs w:val="22"/>
-        </w:rPr>
-        <w:t xml:space="preserve">Make each LED report on its own wheel.</w:t>
+        <w:t xml:space="preserve">That wheel going backward: red.</w:t>
       </w:r>
     </w:p>
     <w:p>
@@ -1961,40 +2760,6 @@
           <w:sz w:val="22"/>
           <w:szCs w:val="22"/>
         </w:rPr>
-        <w:t xml:space="preserve">That wheel going forward: the LED on that side is green.</w:t>
-      </w:r>
-    </w:p>
-    <w:p>
-      <w:pPr>
-        <w:pStyle w:val="ListParagraph"/>
-        <w:numPr>
-          <w:ilvl w:val="0"/>
-          <w:numId w:val="2"/>
-        </w:numPr>
-        <w:spacing w:after="80" w:line="276"/>
-      </w:pPr>
-      <w:r>
-        <w:rPr>
-          <w:sz w:val="22"/>
-          <w:szCs w:val="22"/>
-        </w:rPr>
-        <w:t xml:space="preserve">That wheel going backward: red.</w:t>
-      </w:r>
-    </w:p>
-    <w:p>
-      <w:pPr>
-        <w:pStyle w:val="ListParagraph"/>
-        <w:numPr>
-          <w:ilvl w:val="0"/>
-          <w:numId w:val="2"/>
-        </w:numPr>
-        <w:spacing w:after="80" w:line="276"/>
-      </w:pPr>
-      <w:r>
-        <w:rPr>
-          <w:sz w:val="22"/>
-          <w:szCs w:val="22"/>
-        </w:rPr>
         <w:t xml:space="preserve">That wheel stopped: white.</w:t>
       </w:r>
     </w:p>
@@ -2007,192 +2772,20 @@
       <w:pPr>
         <w:spacing w:after="120" w:line="276"/>
       </w:pPr>
-      <w:r>
-        <w:rPr>
-          <w:sz w:val="22"/>
-          <w:szCs w:val="22"/>
-        </w:rPr>
-        <w:t xml:space="preserve">The left LED watches </w:t>
-      </w:r>
       <w:r>
         <w:rPr>
           <w:rFonts w:ascii="Roboto Mono" w:cs="Roboto Mono" w:eastAsia="Roboto Mono" w:hAnsi="Roboto Mono"/>
           <w:sz w:val="19"/>
           <w:szCs w:val="19"/>
         </w:rPr>
-        <w:t xml:space="preserve">left_speed</w:t>
-      </w:r>
-      <w:r>
-        <w:rPr>
-          <w:sz w:val="22"/>
-          <w:szCs w:val="22"/>
-        </w:rPr>
-        <w:t xml:space="preserve">. The right LED watches </w:t>
-      </w:r>
-      <w:r>
-        <w:rPr>
-          <w:rFonts w:ascii="Roboto Mono" w:cs="Roboto Mono" w:eastAsia="Roboto Mono" w:hAnsi="Roboto Mono"/>
-          <w:sz w:val="19"/>
-          <w:szCs w:val="19"/>
-        </w:rPr>
-        <w:t xml:space="preserve">right_speed</w:t>
-      </w:r>
-      <w:r>
-        <w:rPr>
-          <w:sz w:val="22"/>
-          <w:szCs w:val="22"/>
-        </w:rPr>
-        <w:t xml:space="preserve">. Use an </w:t>
-      </w:r>
-      <w:r>
-        <w:rPr>
-          <w:rFonts w:ascii="Roboto Mono" w:cs="Roboto Mono" w:eastAsia="Roboto Mono" w:hAnsi="Roboto Mono"/>
-          <w:sz w:val="19"/>
-          <w:szCs w:val="19"/>
-        </w:rPr>
-        <w:t xml:space="preserve">if</w:t>
-      </w:r>
-      <w:r>
-        <w:rPr>
-          <w:sz w:val="22"/>
-          <w:szCs w:val="22"/>
-        </w:rPr>
-        <w:t xml:space="preserve"> / </w:t>
-      </w:r>
-      <w:r>
-        <w:rPr>
-          <w:rFonts w:ascii="Roboto Mono" w:cs="Roboto Mono" w:eastAsia="Roboto Mono" w:hAnsi="Roboto Mono"/>
-          <w:sz w:val="19"/>
-          <w:szCs w:val="19"/>
-        </w:rPr>
-        <w:t xml:space="preserve">elif</w:t>
-      </w:r>
-      <w:r>
-        <w:rPr>
-          <w:sz w:val="22"/>
-          <w:szCs w:val="22"/>
-        </w:rPr>
-        <w:t xml:space="preserve"> / </w:t>
-      </w:r>
-      <w:r>
-        <w:rPr>
-          <w:rFonts w:ascii="Roboto Mono" w:cs="Roboto Mono" w:eastAsia="Roboto Mono" w:hAnsi="Roboto Mono"/>
-          <w:sz w:val="19"/>
-          <w:szCs w:val="19"/>
-        </w:rPr>
-        <w:t xml:space="preserve">else</w:t>
-      </w:r>
-      <w:r>
-        <w:rPr>
-          <w:sz w:val="22"/>
-          <w:szCs w:val="22"/>
-        </w:rPr>
-        <w:t xml:space="preserve"> chain like the one you wrote in P01, and write it twice, once per side.</w:t>
-      </w:r>
-    </w:p>
-    <w:p>
-      <w:pPr>
-        <w:spacing w:after="120" w:line="276"/>
-      </w:pPr>
-      <w:r>
-        <w:rPr>
-          <w:sz w:val="22"/>
-          <w:szCs w:val="22"/>
-        </w:rPr>
-        <w:t xml:space="preserve">You do not need to worry about a stick that is </w:t>
-      </w:r>
-      <w:r>
-        <w:rPr>
-          <w:i/>
-          <w:iCs/>
-          <w:sz w:val="22"/>
-          <w:szCs w:val="22"/>
-        </w:rPr>
-        <w:t xml:space="preserve">almost</w:t>
-      </w:r>
-      <w:r>
-        <w:rPr>
-          <w:sz w:val="22"/>
-          <w:szCs w:val="22"/>
-        </w:rPr>
-        <w:t xml:space="preserve"> centered. </w:t>
-      </w:r>
-      <w:r>
-        <w:rPr>
-          <w:rFonts w:ascii="Roboto Mono" w:cs="Roboto Mono" w:eastAsia="Roboto Mono" w:hAnsi="Roboto Mono"/>
-          <w:sz w:val="19"/>
-          <w:szCs w:val="19"/>
-        </w:rPr>
-        <w:t xml:space="preserve">gamepad.left_y</w:t>
-      </w:r>
-      <w:r>
-        <w:rPr>
-          <w:sz w:val="22"/>
-          <w:szCs w:val="22"/>
-        </w:rPr>
-        <w:t xml:space="preserve"> reports a resting stick as exactly 0.0, so plain </w:t>
-      </w:r>
-      <w:r>
-        <w:rPr>
-          <w:rFonts w:ascii="Roboto Mono" w:cs="Roboto Mono" w:eastAsia="Roboto Mono" w:hAnsi="Roboto Mono"/>
-          <w:sz w:val="19"/>
-          <w:szCs w:val="19"/>
-        </w:rPr>
-        <w:t xml:space="preserve">&gt; 0</w:t>
-      </w:r>
-      <w:r>
-        <w:rPr>
-          <w:sz w:val="22"/>
-          <w:szCs w:val="22"/>
-        </w:rPr>
-        <w:t xml:space="preserve"> and </w:t>
-      </w:r>
-      <w:r>
-        <w:rPr>
-          <w:rFonts w:ascii="Roboto Mono" w:cs="Roboto Mono" w:eastAsia="Roboto Mono" w:hAnsi="Roboto Mono"/>
-          <w:sz w:val="19"/>
-          <w:szCs w:val="19"/>
-        </w:rPr>
-        <w:t xml:space="preserve">&lt; 0</w:t>
-      </w:r>
-      <w:r>
-        <w:rPr>
-          <w:sz w:val="22"/>
-          <w:szCs w:val="22"/>
-        </w:rPr>
-        <w:t xml:space="preserve"> tests are enough and the </w:t>
-      </w:r>
-      <w:r>
-        <w:rPr>
-          <w:rFonts w:ascii="Roboto Mono" w:cs="Roboto Mono" w:eastAsia="Roboto Mono" w:hAnsi="Roboto Mono"/>
-          <w:sz w:val="19"/>
-          <w:szCs w:val="19"/>
-        </w:rPr>
-        <w:t xml:space="preserve">else</w:t>
-      </w:r>
-      <w:r>
-        <w:rPr>
-          <w:sz w:val="22"/>
-          <w:szCs w:val="22"/>
-        </w:rPr>
-        <w:t xml:space="preserve"> catches stopped.</w:t>
-      </w:r>
-    </w:p>
-    <w:p>
-      <w:r>
-        <w:br w:type="page"/>
-      </w:r>
-    </w:p>
-    <w:p>
-      <w:r>
-        <w:rPr>
-          <w:i/>
-          <w:iCs/>
-          <w:color w:val="A6A6A6"/>
-          <w:sz w:val="18"/>
-          <w:szCs w:val="18"/>
-        </w:rPr>
-        <w:t xml:space="preserve">This page left blank.</w:t>
+        <w:t xml:space="preserve">sb.light_both_leds</w:t>
+      </w:r>
+      <w:r>
+        <w:rPr>
+          <w:sz w:val="22"/>
+          <w:szCs w:val="22"/>
+        </w:rPr>
+        <w:t xml:space="preserve"> will not help you here. It sets both lights the same, and the whole point is that the two sides can disagree.</w:t>
       </w:r>
     </w:p>
     <w:sectPr>
@@ -2293,7 +2886,7 @@
               <w:sz w:val="17"/>
               <w:szCs w:val="17"/>
             </w:rPr>
-            <w:t xml:space="preserve">Project 03: Gamepad Driving  ·  V03</w:t>
+            <w:t xml:space="preserve">Project 03: Gamepad Driving  ·  V06</w:t>
           </w:r>
         </w:p>
       </w:tc>

</xml_diff>